<commit_message>
Documentación: actualización del Backlog tentativo 13/09 con el equipo
</commit_message>
<xml_diff>
--- a/Documentos_ProyectoTPI/BACKLOG - TENTATIVO.docx
+++ b/Documentos_ProyectoTPI/BACKLOG - TENTATIVO.docx
@@ -179,6 +179,15 @@
         </w:rPr>
         <w:t>Pensar y maquetar las pantallas que se presentarán en el primer MVP</w:t>
       </w:r>
+      <w:r>
+        <w:rPr>
+          <w:rFonts w:ascii="Aptos" w:hAnsi="Aptos"/>
+          <w:sz w:val="24"/>
+          <w:szCs w:val="24"/>
+          <w:lang w:val="es-419"/>
+        </w:rPr>
+        <w:t>.</w:t>
+      </w:r>
     </w:p>
     <w:p>
       <w:pPr>
@@ -231,6 +240,15 @@
         </w:rPr>
         <w:t>control de versiones</w:t>
       </w:r>
+      <w:r>
+        <w:rPr>
+          <w:rFonts w:ascii="Aptos" w:hAnsi="Aptos"/>
+          <w:sz w:val="24"/>
+          <w:szCs w:val="24"/>
+          <w:lang w:val="es-419"/>
+        </w:rPr>
+        <w:t>.</w:t>
+      </w:r>
     </w:p>
     <w:p>
       <w:pPr>
@@ -254,7 +272,16 @@
           <w:szCs w:val="24"/>
           <w:lang w:val="es-419"/>
         </w:rPr>
-        <w:t xml:space="preserve">Identificar funcionalidades principales de la aplicación </w:t>
+        <w:t>Identificar funcionalidades principales de la aplicación</w:t>
+      </w:r>
+      <w:r>
+        <w:rPr>
+          <w:rFonts w:ascii="Aptos" w:hAnsi="Aptos"/>
+          <w:sz w:val="24"/>
+          <w:szCs w:val="24"/>
+          <w:lang w:val="es-419"/>
+        </w:rPr>
+        <w:t>.</w:t>
       </w:r>
     </w:p>
     <w:p>
@@ -370,6 +397,327 @@
           <w:szCs w:val="28"/>
           <w:lang w:val="es-419"/>
         </w:rPr>
+        <w:t>PANTALLA INICIO DE SESIÓN</w:t>
+      </w:r>
+    </w:p>
+    <w:p>
+      <w:pPr>
+        <w:spacing w:after="0" w:line="240" w:lineRule="auto"/>
+        <w:rPr>
+          <w:rFonts w:ascii="Aptos" w:hAnsi="Aptos"/>
+          <w:sz w:val="24"/>
+          <w:szCs w:val="24"/>
+          <w:lang w:val="es-419"/>
+        </w:rPr>
+      </w:pPr>
+    </w:p>
+    <w:p>
+      <w:pPr>
+        <w:spacing w:after="0" w:line="240" w:lineRule="auto"/>
+        <w:rPr>
+          <w:rFonts w:ascii="Aptos" w:hAnsi="Aptos"/>
+          <w:sz w:val="24"/>
+          <w:szCs w:val="24"/>
+          <w:lang w:val="es-419"/>
+        </w:rPr>
+      </w:pPr>
+      <w:r>
+        <w:rPr>
+          <w:rFonts w:ascii="Aptos" w:hAnsi="Aptos"/>
+          <w:sz w:val="24"/>
+          <w:szCs w:val="24"/>
+          <w:lang w:val="es-419"/>
+        </w:rPr>
+        <w:t xml:space="preserve">Inicio de sesión a la aplicación, solicitud de email y </w:t>
+      </w:r>
+      <w:proofErr w:type="spellStart"/>
+      <w:proofErr w:type="gramStart"/>
+      <w:r>
+        <w:rPr>
+          <w:rFonts w:ascii="Aptos" w:hAnsi="Aptos"/>
+          <w:sz w:val="24"/>
+          <w:szCs w:val="24"/>
+          <w:lang w:val="es-419"/>
+        </w:rPr>
+        <w:t>password</w:t>
+      </w:r>
+      <w:proofErr w:type="spellEnd"/>
+      <w:proofErr w:type="gramEnd"/>
+      <w:r>
+        <w:rPr>
+          <w:rFonts w:ascii="Aptos" w:hAnsi="Aptos"/>
+          <w:sz w:val="24"/>
+          <w:szCs w:val="24"/>
+          <w:lang w:val="es-419"/>
+        </w:rPr>
+        <w:t xml:space="preserve"> al usuario</w:t>
+      </w:r>
+      <w:r>
+        <w:rPr>
+          <w:rFonts w:ascii="Aptos" w:hAnsi="Aptos"/>
+          <w:sz w:val="24"/>
+          <w:szCs w:val="24"/>
+          <w:lang w:val="es-419"/>
+        </w:rPr>
+        <w:br/>
+        <w:t>Funcionalidades</w:t>
+      </w:r>
+    </w:p>
+    <w:p>
+      <w:pPr>
+        <w:pStyle w:val="Prrafodelista"/>
+        <w:numPr>
+          <w:ilvl w:val="0"/>
+          <w:numId w:val="24"/>
+        </w:numPr>
+        <w:spacing w:after="0" w:line="240" w:lineRule="auto"/>
+        <w:rPr>
+          <w:rFonts w:ascii="Aptos" w:hAnsi="Aptos"/>
+          <w:sz w:val="24"/>
+          <w:szCs w:val="24"/>
+          <w:lang w:val="es-419"/>
+        </w:rPr>
+      </w:pPr>
+      <w:r>
+        <w:rPr>
+          <w:rFonts w:ascii="Aptos" w:hAnsi="Aptos"/>
+          <w:sz w:val="24"/>
+          <w:szCs w:val="24"/>
+          <w:lang w:val="es-419"/>
+        </w:rPr>
+        <w:t xml:space="preserve">Dos campos de solicitud de datos para email y </w:t>
+      </w:r>
+      <w:proofErr w:type="spellStart"/>
+      <w:proofErr w:type="gramStart"/>
+      <w:r>
+        <w:rPr>
+          <w:rFonts w:ascii="Aptos" w:hAnsi="Aptos"/>
+          <w:sz w:val="24"/>
+          <w:szCs w:val="24"/>
+          <w:lang w:val="es-419"/>
+        </w:rPr>
+        <w:t>password</w:t>
+      </w:r>
+      <w:proofErr w:type="spellEnd"/>
+      <w:proofErr w:type="gramEnd"/>
+    </w:p>
+    <w:p>
+      <w:pPr>
+        <w:pStyle w:val="Prrafodelista"/>
+        <w:numPr>
+          <w:ilvl w:val="0"/>
+          <w:numId w:val="24"/>
+        </w:numPr>
+        <w:spacing w:after="0" w:line="240" w:lineRule="auto"/>
+        <w:rPr>
+          <w:rFonts w:ascii="Aptos" w:hAnsi="Aptos"/>
+          <w:sz w:val="24"/>
+          <w:szCs w:val="24"/>
+          <w:lang w:val="es-419"/>
+        </w:rPr>
+      </w:pPr>
+      <w:r>
+        <w:rPr>
+          <w:rFonts w:ascii="Aptos" w:hAnsi="Aptos"/>
+          <w:sz w:val="24"/>
+          <w:szCs w:val="24"/>
+          <w:lang w:val="es-419"/>
+        </w:rPr>
+        <w:t xml:space="preserve">Funcionalidad de recuperación de </w:t>
+      </w:r>
+      <w:proofErr w:type="spellStart"/>
+      <w:proofErr w:type="gramStart"/>
+      <w:r>
+        <w:rPr>
+          <w:rFonts w:ascii="Aptos" w:hAnsi="Aptos"/>
+          <w:sz w:val="24"/>
+          <w:szCs w:val="24"/>
+          <w:lang w:val="es-419"/>
+        </w:rPr>
+        <w:t>password</w:t>
+      </w:r>
+      <w:proofErr w:type="spellEnd"/>
+      <w:proofErr w:type="gramEnd"/>
+      <w:r>
+        <w:rPr>
+          <w:rFonts w:ascii="Aptos" w:hAnsi="Aptos"/>
+          <w:sz w:val="24"/>
+          <w:szCs w:val="24"/>
+          <w:lang w:val="es-419"/>
+        </w:rPr>
+        <w:t xml:space="preserve"> (</w:t>
+      </w:r>
+      <w:proofErr w:type="spellStart"/>
+      <w:proofErr w:type="gramStart"/>
+      <w:r>
+        <w:rPr>
+          <w:rFonts w:ascii="Aptos" w:hAnsi="Aptos"/>
+          <w:sz w:val="24"/>
+          <w:szCs w:val="24"/>
+          <w:lang w:val="es-419"/>
+        </w:rPr>
+        <w:t>Forgot</w:t>
+      </w:r>
+      <w:proofErr w:type="spellEnd"/>
+      <w:r>
+        <w:rPr>
+          <w:rFonts w:ascii="Aptos" w:hAnsi="Aptos"/>
+          <w:sz w:val="24"/>
+          <w:szCs w:val="24"/>
+          <w:lang w:val="es-419"/>
+        </w:rPr>
+        <w:t xml:space="preserve"> </w:t>
+      </w:r>
+      <w:proofErr w:type="spellStart"/>
+      <w:r>
+        <w:rPr>
+          <w:rFonts w:ascii="Aptos" w:hAnsi="Aptos"/>
+          <w:sz w:val="24"/>
+          <w:szCs w:val="24"/>
+          <w:lang w:val="es-419"/>
+        </w:rPr>
+        <w:t>you</w:t>
+      </w:r>
+      <w:proofErr w:type="spellEnd"/>
+      <w:r>
+        <w:rPr>
+          <w:rFonts w:ascii="Aptos" w:hAnsi="Aptos"/>
+          <w:sz w:val="24"/>
+          <w:szCs w:val="24"/>
+          <w:lang w:val="es-419"/>
+        </w:rPr>
+        <w:t xml:space="preserve"> </w:t>
+      </w:r>
+      <w:proofErr w:type="spellStart"/>
+      <w:r>
+        <w:rPr>
+          <w:rFonts w:ascii="Aptos" w:hAnsi="Aptos"/>
+          <w:sz w:val="24"/>
+          <w:szCs w:val="24"/>
+          <w:lang w:val="es-419"/>
+        </w:rPr>
+        <w:t>password</w:t>
+      </w:r>
+      <w:proofErr w:type="spellEnd"/>
+      <w:r>
+        <w:rPr>
+          <w:rFonts w:ascii="Aptos" w:hAnsi="Aptos"/>
+          <w:sz w:val="24"/>
+          <w:szCs w:val="24"/>
+          <w:lang w:val="es-419"/>
+        </w:rPr>
+        <w:t>?</w:t>
+      </w:r>
+      <w:proofErr w:type="gramEnd"/>
+      <w:r>
+        <w:rPr>
+          <w:rFonts w:ascii="Aptos" w:hAnsi="Aptos"/>
+          <w:sz w:val="24"/>
+          <w:szCs w:val="24"/>
+          <w:lang w:val="es-419"/>
+        </w:rPr>
+        <w:t>)</w:t>
+      </w:r>
+    </w:p>
+    <w:p>
+      <w:pPr>
+        <w:pStyle w:val="Prrafodelista"/>
+        <w:numPr>
+          <w:ilvl w:val="0"/>
+          <w:numId w:val="24"/>
+        </w:numPr>
+        <w:spacing w:after="0" w:line="240" w:lineRule="auto"/>
+        <w:rPr>
+          <w:rFonts w:ascii="Aptos" w:hAnsi="Aptos"/>
+          <w:sz w:val="24"/>
+          <w:szCs w:val="24"/>
+          <w:lang w:val="es-419"/>
+        </w:rPr>
+      </w:pPr>
+      <w:r>
+        <w:rPr>
+          <w:rFonts w:ascii="Aptos" w:hAnsi="Aptos"/>
+          <w:sz w:val="24"/>
+          <w:szCs w:val="24"/>
+          <w:lang w:val="es-419"/>
+        </w:rPr>
+        <w:t xml:space="preserve">Dos botones de </w:t>
+      </w:r>
+      <w:proofErr w:type="spellStart"/>
+      <w:r>
+        <w:rPr>
+          <w:rFonts w:ascii="Aptos" w:hAnsi="Aptos"/>
+          <w:sz w:val="24"/>
+          <w:szCs w:val="24"/>
+          <w:lang w:val="es-419"/>
+        </w:rPr>
+        <w:t>Login</w:t>
+      </w:r>
+      <w:proofErr w:type="spellEnd"/>
+      <w:r>
+        <w:rPr>
+          <w:rFonts w:ascii="Aptos" w:hAnsi="Aptos"/>
+          <w:sz w:val="24"/>
+          <w:szCs w:val="24"/>
+          <w:lang w:val="es-419"/>
+        </w:rPr>
+        <w:t xml:space="preserve"> y </w:t>
+      </w:r>
+      <w:proofErr w:type="spellStart"/>
+      <w:r>
+        <w:rPr>
+          <w:rFonts w:ascii="Aptos" w:hAnsi="Aptos"/>
+          <w:sz w:val="24"/>
+          <w:szCs w:val="24"/>
+          <w:lang w:val="es-419"/>
+        </w:rPr>
+        <w:t>Register</w:t>
+      </w:r>
+      <w:proofErr w:type="spellEnd"/>
+      <w:r>
+        <w:rPr>
+          <w:rFonts w:ascii="Aptos" w:hAnsi="Aptos"/>
+          <w:sz w:val="24"/>
+          <w:szCs w:val="24"/>
+          <w:lang w:val="es-419"/>
+        </w:rPr>
+        <w:t>.</w:t>
+      </w:r>
+    </w:p>
+    <w:p>
+      <w:pPr>
+        <w:spacing w:after="0" w:line="240" w:lineRule="auto"/>
+        <w:rPr>
+          <w:rFonts w:ascii="Aptos" w:hAnsi="Aptos"/>
+          <w:sz w:val="24"/>
+          <w:szCs w:val="24"/>
+          <w:lang w:val="es-419"/>
+        </w:rPr>
+      </w:pPr>
+    </w:p>
+    <w:p>
+      <w:pPr>
+        <w:spacing w:after="0" w:line="240" w:lineRule="auto"/>
+        <w:rPr>
+          <w:rFonts w:ascii="Aptos" w:hAnsi="Aptos"/>
+          <w:b/>
+          <w:bCs/>
+          <w:color w:val="002060"/>
+          <w:sz w:val="28"/>
+          <w:szCs w:val="28"/>
+          <w:lang w:val="es-419"/>
+        </w:rPr>
+      </w:pPr>
+      <w:r>
+        <w:rPr>
+          <w:rFonts w:ascii="Aptos" w:hAnsi="Aptos"/>
+          <w:b/>
+          <w:bCs/>
+          <w:color w:val="002060"/>
+          <w:sz w:val="28"/>
+          <w:szCs w:val="28"/>
+          <w:lang w:val="es-419"/>
+        </w:rPr>
         <w:t>PANTALLA HOME</w:t>
       </w:r>
     </w:p>
@@ -402,27 +750,7 @@
           <w:szCs w:val="24"/>
           <w:lang w:val="es-419"/>
         </w:rPr>
-        <w:t>Floating</w:t>
-      </w:r>
-      <w:proofErr w:type="spellEnd"/>
-      <w:r>
-        <w:rPr>
-          <w:rFonts w:ascii="Aptos" w:hAnsi="Aptos"/>
-          <w:sz w:val="24"/>
-          <w:szCs w:val="24"/>
-          <w:lang w:val="es-419"/>
-        </w:rPr>
-        <w:t xml:space="preserve"> </w:t>
-      </w:r>
-      <w:proofErr w:type="spellStart"/>
-      <w:r>
-        <w:rPr>
-          <w:rFonts w:ascii="Aptos" w:hAnsi="Aptos"/>
-          <w:sz w:val="24"/>
-          <w:szCs w:val="24"/>
-          <w:lang w:val="es-419"/>
-        </w:rPr>
-        <w:t>Button</w:t>
+        <w:t>BurgerMenu</w:t>
       </w:r>
       <w:proofErr w:type="spellEnd"/>
       <w:r>
@@ -549,6 +877,71 @@
     <w:p>
       <w:pPr>
         <w:pStyle w:val="Prrafodelista"/>
+        <w:numPr>
+          <w:ilvl w:val="0"/>
+          <w:numId w:val="22"/>
+        </w:numPr>
+        <w:spacing w:after="0" w:line="240" w:lineRule="auto"/>
+        <w:rPr>
+          <w:rFonts w:ascii="Aptos" w:hAnsi="Aptos"/>
+          <w:sz w:val="24"/>
+          <w:szCs w:val="24"/>
+          <w:lang w:val="es-419"/>
+        </w:rPr>
+      </w:pPr>
+      <w:r>
+        <w:rPr>
+          <w:rFonts w:ascii="Aptos" w:hAnsi="Aptos"/>
+          <w:sz w:val="24"/>
+          <w:szCs w:val="24"/>
+          <w:lang w:val="es-419"/>
+        </w:rPr>
+        <w:t xml:space="preserve">Acceso al </w:t>
+      </w:r>
+      <w:proofErr w:type="spellStart"/>
+      <w:r>
+        <w:rPr>
+          <w:rFonts w:ascii="Aptos" w:hAnsi="Aptos"/>
+          <w:sz w:val="24"/>
+          <w:szCs w:val="24"/>
+          <w:lang w:val="es-419"/>
+        </w:rPr>
+        <w:t>About</w:t>
+      </w:r>
+      <w:proofErr w:type="spellEnd"/>
+      <w:r>
+        <w:rPr>
+          <w:rFonts w:ascii="Aptos" w:hAnsi="Aptos"/>
+          <w:sz w:val="24"/>
+          <w:szCs w:val="24"/>
+          <w:lang w:val="es-419"/>
+        </w:rPr>
+        <w:t xml:space="preserve"> de la </w:t>
+      </w:r>
+      <w:proofErr w:type="gramStart"/>
+      <w:r>
+        <w:rPr>
+          <w:rFonts w:ascii="Aptos" w:hAnsi="Aptos"/>
+          <w:sz w:val="24"/>
+          <w:szCs w:val="24"/>
+          <w:lang w:val="es-419"/>
+        </w:rPr>
+        <w:t>app</w:t>
+      </w:r>
+      <w:proofErr w:type="gramEnd"/>
+      <w:r>
+        <w:rPr>
+          <w:rFonts w:ascii="Aptos" w:hAnsi="Aptos"/>
+          <w:sz w:val="24"/>
+          <w:szCs w:val="24"/>
+          <w:lang w:val="es-419"/>
+        </w:rPr>
+        <w:t>.</w:t>
+      </w:r>
+    </w:p>
+    <w:p>
+      <w:pPr>
+        <w:pStyle w:val="Prrafodelista"/>
         <w:spacing w:after="0" w:line="240" w:lineRule="auto"/>
         <w:rPr>
           <w:rFonts w:ascii="Aptos" w:hAnsi="Aptos"/>
@@ -708,6 +1101,7 @@
           <w:szCs w:val="24"/>
           <w:lang w:val="es-419"/>
         </w:rPr>
+        <w:lastRenderedPageBreak/>
         <w:t xml:space="preserve">Proyectos presentados en formato </w:t>
       </w:r>
       <w:proofErr w:type="spellStart"/>
@@ -872,7 +1266,7 @@
           <w:szCs w:val="24"/>
           <w:lang w:val="es-419"/>
         </w:rPr>
-        <w:t xml:space="preserve"> vertical de videos</w:t>
+        <w:t xml:space="preserve"> de videos</w:t>
       </w:r>
       <w:r>
         <w:rPr>
@@ -919,6 +1313,24 @@
           <w:lang w:val="es-419"/>
         </w:rPr>
       </w:pPr>
+      <w:r>
+        <w:rPr>
+          <w:rFonts w:ascii="Aptos" w:hAnsi="Aptos"/>
+          <w:sz w:val="24"/>
+          <w:szCs w:val="24"/>
+          <w:lang w:val="es-419"/>
+        </w:rPr>
+        <w:t>Reproducir videos</w:t>
+      </w:r>
+      <w:r>
+        <w:rPr>
+          <w:rFonts w:ascii="Aptos" w:hAnsi="Aptos"/>
+          <w:sz w:val="24"/>
+          <w:szCs w:val="24"/>
+          <w:lang w:val="es-419"/>
+        </w:rPr>
+        <w:t>/</w:t>
+      </w:r>
       <w:proofErr w:type="spellStart"/>
       <w:r>
         <w:rPr>
@@ -937,7 +1349,7 @@
           <w:szCs w:val="24"/>
           <w:lang w:val="es-419"/>
         </w:rPr>
-        <w:t>/Reproducir videos</w:t>
+        <w:t xml:space="preserve"> </w:t>
       </w:r>
     </w:p>
     <w:p>
@@ -962,7 +1374,43 @@
           <w:szCs w:val="24"/>
           <w:lang w:val="es-419"/>
         </w:rPr>
-        <w:t>Filtros con criterio de orden a definir (Tiempo, Afinidad, seguidor o seguido, estilo, instrumento, género, etc.)</w:t>
+        <w:t>Filtros con criterio de orden a definir (</w:t>
+      </w:r>
+      <w:r>
+        <w:rPr>
+          <w:rFonts w:ascii="Aptos" w:hAnsi="Aptos"/>
+          <w:sz w:val="24"/>
+          <w:szCs w:val="24"/>
+          <w:lang w:val="es-419"/>
+        </w:rPr>
+        <w:t xml:space="preserve">Favorito, Más reproducido, Duración, </w:t>
+      </w:r>
+      <w:r>
+        <w:rPr>
+          <w:rFonts w:ascii="Aptos" w:hAnsi="Aptos"/>
+          <w:sz w:val="24"/>
+          <w:szCs w:val="24"/>
+          <w:lang w:val="es-419"/>
+        </w:rPr>
+        <w:t>Fecha de publicación, Género</w:t>
+      </w:r>
+      <w:r>
+        <w:rPr>
+          <w:rFonts w:ascii="Aptos" w:hAnsi="Aptos"/>
+          <w:sz w:val="24"/>
+          <w:szCs w:val="24"/>
+          <w:lang w:val="es-419"/>
+        </w:rPr>
+        <w:t xml:space="preserve"> </w:t>
+      </w:r>
+      <w:r>
+        <w:rPr>
+          <w:rFonts w:ascii="Aptos" w:hAnsi="Aptos"/>
+          <w:sz w:val="24"/>
+          <w:szCs w:val="24"/>
+          <w:lang w:val="es-419"/>
+        </w:rPr>
+        <w:t>)</w:t>
       </w:r>
     </w:p>
     <w:p>
@@ -987,7 +1435,7 @@
           <w:szCs w:val="24"/>
           <w:lang w:val="es-419"/>
         </w:rPr>
-        <w:t xml:space="preserve">Posibilidad de compartir, comentar, </w:t>
+        <w:t xml:space="preserve">Posibilidad de </w:t>
       </w:r>
       <w:proofErr w:type="spellStart"/>
       <w:r>
@@ -999,17 +1447,68 @@
           <w:szCs w:val="24"/>
           <w:lang w:val="es-419"/>
         </w:rPr>
-        <w:t>likear</w:t>
+        <w:t>Likear</w:t>
       </w:r>
       <w:proofErr w:type="spellEnd"/>
       <w:r>
         <w:rPr>
           <w:rFonts w:ascii="Aptos" w:hAnsi="Aptos"/>
-          <w:sz w:val="24"/>
-          <w:szCs w:val="24"/>
-          <w:lang w:val="es-419"/>
-        </w:rPr>
-        <w:t>, recomendar en todos los proyectos</w:t>
+          <w:i/>
+          <w:iCs/>
+          <w:sz w:val="24"/>
+          <w:szCs w:val="24"/>
+          <w:lang w:val="es-419"/>
+        </w:rPr>
+        <w:t xml:space="preserve"> (corazón), </w:t>
+      </w:r>
+      <w:r>
+        <w:rPr>
+          <w:rFonts w:ascii="Aptos" w:hAnsi="Aptos"/>
+          <w:sz w:val="24"/>
+          <w:szCs w:val="24"/>
+          <w:lang w:val="es-419"/>
+        </w:rPr>
+        <w:t xml:space="preserve">Comentar, Compartir, </w:t>
+      </w:r>
+      <w:r>
+        <w:rPr>
+          <w:rFonts w:ascii="Aptos" w:hAnsi="Aptos"/>
+          <w:i/>
+          <w:iCs/>
+          <w:sz w:val="24"/>
+          <w:szCs w:val="24"/>
+          <w:lang w:val="es-419"/>
+        </w:rPr>
+        <w:t>R</w:t>
+      </w:r>
+      <w:r>
+        <w:rPr>
+          <w:rFonts w:ascii="Aptos" w:hAnsi="Aptos"/>
+          <w:i/>
+          <w:iCs/>
+          <w:sz w:val="24"/>
+          <w:szCs w:val="24"/>
+          <w:lang w:val="es-419"/>
+        </w:rPr>
+        <w:t>ecomendar</w:t>
+      </w:r>
+      <w:r>
+        <w:rPr>
+          <w:rFonts w:ascii="Aptos" w:hAnsi="Aptos"/>
+          <w:sz w:val="24"/>
+          <w:szCs w:val="24"/>
+          <w:lang w:val="es-419"/>
+        </w:rPr>
+        <w:t xml:space="preserve"> en todos los proyectos</w:t>
+      </w:r>
+      <w:r>
+        <w:rPr>
+          <w:rFonts w:ascii="Aptos" w:hAnsi="Aptos"/>
+          <w:sz w:val="24"/>
+          <w:szCs w:val="24"/>
+          <w:lang w:val="es-419"/>
+        </w:rPr>
+        <w:t>.</w:t>
       </w:r>
     </w:p>
     <w:p>
@@ -1034,7 +1533,34 @@
           <w:szCs w:val="24"/>
           <w:lang w:val="es-419"/>
         </w:rPr>
-        <w:t>Posibilidad de enviar solicitud para unirse a proyecto en curso.</w:t>
+        <w:t>Invitación: p</w:t>
+      </w:r>
+      <w:r>
+        <w:rPr>
+          <w:rFonts w:ascii="Aptos" w:hAnsi="Aptos"/>
+          <w:sz w:val="24"/>
+          <w:szCs w:val="24"/>
+          <w:lang w:val="es-419"/>
+        </w:rPr>
+        <w:t xml:space="preserve">osibilidad de enviar solicitud para unirse a </w:t>
+      </w:r>
+      <w:r>
+        <w:rPr>
+          <w:rFonts w:ascii="Aptos" w:hAnsi="Aptos"/>
+          <w:sz w:val="24"/>
+          <w:szCs w:val="24"/>
+          <w:lang w:val="es-419"/>
+        </w:rPr>
+        <w:t xml:space="preserve">un </w:t>
+      </w:r>
+      <w:r>
+        <w:rPr>
+          <w:rFonts w:ascii="Aptos" w:hAnsi="Aptos"/>
+          <w:sz w:val="24"/>
+          <w:szCs w:val="24"/>
+          <w:lang w:val="es-419"/>
+        </w:rPr>
+        <w:t>proyecto en curso.</w:t>
       </w:r>
     </w:p>
     <w:p>
@@ -1061,6 +1587,15 @@
         </w:rPr>
         <w:t>Filtros de proyectos finalizados o en curso</w:t>
       </w:r>
+      <w:r>
+        <w:rPr>
+          <w:rFonts w:ascii="Aptos" w:hAnsi="Aptos"/>
+          <w:sz w:val="24"/>
+          <w:szCs w:val="24"/>
+          <w:lang w:val="es-419"/>
+        </w:rPr>
+        <w:t>.</w:t>
+      </w:r>
     </w:p>
     <w:p>
       <w:pPr>
@@ -1229,6 +1764,17 @@
     </w:p>
     <w:p>
       <w:pPr>
+        <w:spacing w:after="0" w:line="240" w:lineRule="auto"/>
+        <w:rPr>
+          <w:rFonts w:ascii="Aptos" w:hAnsi="Aptos"/>
+          <w:sz w:val="24"/>
+          <w:szCs w:val="24"/>
+          <w:lang w:val="es-419"/>
+        </w:rPr>
+      </w:pPr>
+    </w:p>
+    <w:p>
+      <w:pPr>
         <w:pStyle w:val="Prrafodelista"/>
         <w:numPr>
           <w:ilvl w:val="0"/>
@@ -1249,7 +1795,7 @@
           <w:szCs w:val="24"/>
           <w:lang w:val="es-419"/>
         </w:rPr>
-        <w:t>Perfil de usuario (profesor/profesional/estudiante/entusiasta/amateur)</w:t>
+        <w:t>Barra de búsqueda vertical superior.</w:t>
       </w:r>
     </w:p>
     <w:p>
@@ -1274,16 +1820,43 @@
           <w:szCs w:val="24"/>
           <w:lang w:val="es-419"/>
         </w:rPr>
-        <w:t xml:space="preserve">Filtro con criterio de orden a definir </w:t>
-      </w:r>
-      <w:r>
-        <w:rPr>
-          <w:rFonts w:ascii="Aptos" w:hAnsi="Aptos"/>
-          <w:sz w:val="24"/>
-          <w:szCs w:val="24"/>
-          <w:lang w:val="es-419"/>
-        </w:rPr>
-        <w:t>(geolocalización, ciudad, provincia, cercanía)</w:t>
+        <w:t>Perfil</w:t>
+      </w:r>
+      <w:r>
+        <w:rPr>
+          <w:rFonts w:ascii="Aptos" w:hAnsi="Aptos"/>
+          <w:sz w:val="24"/>
+          <w:szCs w:val="24"/>
+          <w:lang w:val="es-419"/>
+        </w:rPr>
+        <w:t>es</w:t>
+      </w:r>
+      <w:r>
+        <w:rPr>
+          <w:rFonts w:ascii="Aptos" w:hAnsi="Aptos"/>
+          <w:sz w:val="24"/>
+          <w:szCs w:val="24"/>
+          <w:lang w:val="es-419"/>
+        </w:rPr>
+        <w:t xml:space="preserve"> de usuario</w:t>
+      </w:r>
+      <w:r>
+        <w:rPr>
+          <w:rFonts w:ascii="Aptos" w:hAnsi="Aptos"/>
+          <w:sz w:val="24"/>
+          <w:szCs w:val="24"/>
+          <w:lang w:val="es-419"/>
+        </w:rPr>
+        <w:t>s</w:t>
+      </w:r>
+      <w:r>
+        <w:rPr>
+          <w:rFonts w:ascii="Aptos" w:hAnsi="Aptos"/>
+          <w:sz w:val="24"/>
+          <w:szCs w:val="24"/>
+          <w:lang w:val="es-419"/>
+        </w:rPr>
+        <w:t>.</w:t>
       </w:r>
     </w:p>
     <w:p>
@@ -1308,27 +1881,122 @@
           <w:szCs w:val="24"/>
           <w:lang w:val="es-419"/>
         </w:rPr>
+        <w:t xml:space="preserve">Filtro con criterio de orden a definir </w:t>
+      </w:r>
+      <w:r>
+        <w:rPr>
+          <w:rFonts w:ascii="Aptos" w:hAnsi="Aptos"/>
+          <w:sz w:val="24"/>
+          <w:szCs w:val="24"/>
+          <w:lang w:val="es-419"/>
+        </w:rPr>
+        <w:t>(</w:t>
+      </w:r>
+      <w:r>
+        <w:rPr>
+          <w:rFonts w:ascii="Aptos" w:hAnsi="Aptos"/>
+          <w:sz w:val="24"/>
+          <w:szCs w:val="24"/>
+          <w:lang w:val="es-419"/>
+        </w:rPr>
+        <w:t>C</w:t>
+      </w:r>
+      <w:r>
+        <w:rPr>
+          <w:rFonts w:ascii="Aptos" w:hAnsi="Aptos"/>
+          <w:sz w:val="24"/>
+          <w:szCs w:val="24"/>
+          <w:lang w:val="es-419"/>
+        </w:rPr>
+        <w:t xml:space="preserve">iudad, </w:t>
+      </w:r>
+      <w:r>
+        <w:rPr>
+          <w:rFonts w:ascii="Aptos" w:hAnsi="Aptos"/>
+          <w:sz w:val="24"/>
+          <w:szCs w:val="24"/>
+          <w:lang w:val="es-419"/>
+        </w:rPr>
+        <w:t>Pr</w:t>
+      </w:r>
+      <w:r>
+        <w:rPr>
+          <w:rFonts w:ascii="Aptos" w:hAnsi="Aptos"/>
+          <w:sz w:val="24"/>
+          <w:szCs w:val="24"/>
+          <w:lang w:val="es-419"/>
+        </w:rPr>
+        <w:t>ovincia,</w:t>
+      </w:r>
+      <w:r>
+        <w:rPr>
+          <w:rFonts w:ascii="Aptos" w:hAnsi="Aptos"/>
+          <w:sz w:val="24"/>
+          <w:szCs w:val="24"/>
+          <w:lang w:val="es-419"/>
+        </w:rPr>
+        <w:t xml:space="preserve"> Instrumentos</w:t>
+      </w:r>
+      <w:r>
+        <w:rPr>
+          <w:rFonts w:ascii="Aptos" w:hAnsi="Aptos"/>
+          <w:sz w:val="24"/>
+          <w:szCs w:val="24"/>
+          <w:lang w:val="es-419"/>
+        </w:rPr>
+        <w:t>)</w:t>
+      </w:r>
+    </w:p>
+    <w:p>
+      <w:pPr>
+        <w:pStyle w:val="Prrafodelista"/>
+        <w:numPr>
+          <w:ilvl w:val="0"/>
+          <w:numId w:val="20"/>
+        </w:numPr>
+        <w:spacing w:after="0" w:line="240" w:lineRule="auto"/>
+        <w:rPr>
+          <w:rFonts w:ascii="Aptos" w:hAnsi="Aptos"/>
+          <w:sz w:val="24"/>
+          <w:szCs w:val="24"/>
+          <w:lang w:val="es-419"/>
+        </w:rPr>
+      </w:pPr>
+      <w:r>
+        <w:rPr>
+          <w:rFonts w:ascii="Aptos" w:hAnsi="Aptos"/>
+          <w:sz w:val="24"/>
+          <w:szCs w:val="24"/>
+          <w:lang w:val="es-419"/>
+        </w:rPr>
         <w:t xml:space="preserve">Reproducir video </w:t>
       </w:r>
-      <w:proofErr w:type="spellStart"/>
-      <w:r>
-        <w:rPr>
-          <w:rFonts w:ascii="Aptos" w:hAnsi="Aptos"/>
-          <w:sz w:val="24"/>
-          <w:szCs w:val="24"/>
-          <w:lang w:val="es-419"/>
-        </w:rPr>
-        <w:t>micro-learning</w:t>
-      </w:r>
-      <w:proofErr w:type="spellEnd"/>
-      <w:r>
-        <w:rPr>
-          <w:rFonts w:ascii="Aptos" w:hAnsi="Aptos"/>
-          <w:sz w:val="24"/>
-          <w:szCs w:val="24"/>
-          <w:lang w:val="es-419"/>
-        </w:rPr>
-        <w:t xml:space="preserve"> de muestra de la propuesta del usuario (profesor/profesional)</w:t>
+      <w:r>
+        <w:rPr>
+          <w:rFonts w:ascii="Aptos" w:hAnsi="Aptos"/>
+          <w:sz w:val="24"/>
+          <w:szCs w:val="24"/>
+          <w:lang w:val="es-419"/>
+        </w:rPr>
+        <w:t>carta de presentación</w:t>
+      </w:r>
+      <w:r>
+        <w:rPr>
+          <w:rFonts w:ascii="Aptos" w:hAnsi="Aptos"/>
+          <w:sz w:val="24"/>
+          <w:szCs w:val="24"/>
+          <w:lang w:val="es-419"/>
+        </w:rPr>
+        <w:t xml:space="preserve"> de la propuesta del usuario (profesor/profesional)</w:t>
+      </w:r>
+      <w:r>
+        <w:rPr>
+          <w:rFonts w:ascii="Aptos" w:hAnsi="Aptos"/>
+          <w:sz w:val="24"/>
+          <w:szCs w:val="24"/>
+          <w:lang w:val="es-419"/>
+        </w:rPr>
+        <w:t>.</w:t>
       </w:r>
     </w:p>
     <w:p>
@@ -1461,6 +2129,17 @@
     </w:p>
     <w:p>
       <w:pPr>
+        <w:spacing w:after="0" w:line="240" w:lineRule="auto"/>
+        <w:rPr>
+          <w:rFonts w:ascii="Aptos" w:hAnsi="Aptos"/>
+          <w:sz w:val="24"/>
+          <w:szCs w:val="24"/>
+          <w:lang w:val="es-419"/>
+        </w:rPr>
+      </w:pPr>
+    </w:p>
+    <w:p>
+      <w:pPr>
         <w:pStyle w:val="Prrafodelista"/>
         <w:numPr>
           <w:ilvl w:val="0"/>
@@ -1481,31 +2160,6 @@
           <w:szCs w:val="24"/>
           <w:lang w:val="es-419"/>
         </w:rPr>
-        <w:t>Filtros con criterio de orden a definir (Tiempo, Afinidad, seguidor o seguido, estilo, instrumento, género, etc.)</w:t>
-      </w:r>
-    </w:p>
-    <w:p>
-      <w:pPr>
-        <w:pStyle w:val="Prrafodelista"/>
-        <w:numPr>
-          <w:ilvl w:val="0"/>
-          <w:numId w:val="21"/>
-        </w:numPr>
-        <w:spacing w:after="0" w:line="240" w:lineRule="auto"/>
-        <w:rPr>
-          <w:rFonts w:ascii="Aptos" w:hAnsi="Aptos"/>
-          <w:sz w:val="24"/>
-          <w:szCs w:val="24"/>
-          <w:lang w:val="es-419"/>
-        </w:rPr>
-      </w:pPr>
-      <w:r>
-        <w:rPr>
-          <w:rFonts w:ascii="Aptos" w:hAnsi="Aptos"/>
-          <w:sz w:val="24"/>
-          <w:szCs w:val="24"/>
-          <w:lang w:val="es-419"/>
-        </w:rPr>
         <w:t xml:space="preserve">Posibilidad de </w:t>
       </w:r>
       <w:r>
@@ -1556,6 +2210,18 @@
         </w:rPr>
         <w:t>4. SALA DE ENSAYO</w:t>
       </w:r>
+      <w:r>
+        <w:rPr>
+          <w:rFonts w:ascii="Aptos" w:hAnsi="Aptos"/>
+          <w:b/>
+          <w:bCs/>
+          <w:color w:val="002060"/>
+          <w:sz w:val="28"/>
+          <w:szCs w:val="28"/>
+          <w:lang w:val="es-419"/>
+        </w:rPr>
+        <w:t xml:space="preserve"> (Lista de proyectos)</w:t>
+      </w:r>
     </w:p>
     <w:p>
       <w:pPr>
@@ -1746,7 +2412,99 @@
           <w:szCs w:val="24"/>
           <w:lang w:val="es-419"/>
         </w:rPr>
-        <w:t>Reproducción de audios y videos de los proyectos en curso</w:t>
+        <w:lastRenderedPageBreak/>
+        <w:t xml:space="preserve">Reproducción </w:t>
+      </w:r>
+      <w:proofErr w:type="spellStart"/>
+      <w:r>
+        <w:rPr>
+          <w:rFonts w:ascii="Aptos" w:hAnsi="Aptos"/>
+          <w:i/>
+          <w:iCs/>
+          <w:sz w:val="24"/>
+          <w:szCs w:val="24"/>
+          <w:lang w:val="es-419"/>
+        </w:rPr>
+        <w:t>Teaser</w:t>
+      </w:r>
+      <w:proofErr w:type="spellEnd"/>
+      <w:r>
+        <w:rPr>
+          <w:rFonts w:ascii="Aptos" w:hAnsi="Aptos"/>
+          <w:i/>
+          <w:iCs/>
+          <w:sz w:val="24"/>
+          <w:szCs w:val="24"/>
+          <w:lang w:val="es-419"/>
+        </w:rPr>
+        <w:t xml:space="preserve"> </w:t>
+      </w:r>
+      <w:r>
+        <w:rPr>
+          <w:rFonts w:ascii="Aptos" w:hAnsi="Aptos"/>
+          <w:sz w:val="24"/>
+          <w:szCs w:val="24"/>
+          <w:lang w:val="es-419"/>
+        </w:rPr>
+        <w:t xml:space="preserve">de audios </w:t>
+      </w:r>
+      <w:r>
+        <w:rPr>
+          <w:rFonts w:ascii="Aptos" w:hAnsi="Aptos"/>
+          <w:sz w:val="24"/>
+          <w:szCs w:val="24"/>
+          <w:lang w:val="es-419"/>
+        </w:rPr>
+        <w:t xml:space="preserve">con un </w:t>
+      </w:r>
+      <w:proofErr w:type="spellStart"/>
+      <w:r>
+        <w:rPr>
+          <w:rFonts w:ascii="Aptos" w:hAnsi="Aptos"/>
+          <w:i/>
+          <w:iCs/>
+          <w:sz w:val="24"/>
+          <w:szCs w:val="24"/>
+          <w:lang w:val="es-419"/>
+        </w:rPr>
+        <w:t>cover</w:t>
+      </w:r>
+      <w:proofErr w:type="spellEnd"/>
+      <w:r>
+        <w:rPr>
+          <w:rFonts w:ascii="Aptos" w:hAnsi="Aptos"/>
+          <w:sz w:val="24"/>
+          <w:szCs w:val="24"/>
+          <w:lang w:val="es-419"/>
+        </w:rPr>
+        <w:t xml:space="preserve"> </w:t>
+      </w:r>
+      <w:r>
+        <w:rPr>
+          <w:rFonts w:ascii="Aptos" w:hAnsi="Aptos"/>
+          <w:sz w:val="24"/>
+          <w:szCs w:val="24"/>
+          <w:lang w:val="es-419"/>
+        </w:rPr>
+        <w:t xml:space="preserve">de </w:t>
+      </w:r>
+      <w:r>
+        <w:rPr>
+          <w:rFonts w:ascii="Aptos" w:hAnsi="Aptos"/>
+          <w:sz w:val="24"/>
+          <w:szCs w:val="24"/>
+          <w:lang w:val="es-419"/>
+        </w:rPr>
+        <w:t>cada</w:t>
+      </w:r>
+      <w:r>
+        <w:rPr>
+          <w:rFonts w:ascii="Aptos" w:hAnsi="Aptos"/>
+          <w:sz w:val="24"/>
+          <w:szCs w:val="24"/>
+          <w:lang w:val="es-419"/>
+        </w:rPr>
+        <w:t xml:space="preserve"> proyecto en curso</w:t>
       </w:r>
       <w:r>
         <w:rPr>
@@ -1779,16 +2537,158 @@
           <w:szCs w:val="24"/>
           <w:lang w:val="es-419"/>
         </w:rPr>
-        <w:t xml:space="preserve">subir videos/archivos de </w:t>
-      </w:r>
-      <w:r>
-        <w:rPr>
-          <w:rFonts w:ascii="Aptos" w:hAnsi="Aptos"/>
-          <w:sz w:val="24"/>
-          <w:szCs w:val="24"/>
-          <w:lang w:val="es-419"/>
-        </w:rPr>
-        <w:t>Audio, formato MIDI, .WAV, .WAC, .MP3, tablaturas, líricas.</w:t>
+        <w:t xml:space="preserve">Acceso a la edición de audio del </w:t>
+      </w:r>
+      <w:r>
+        <w:rPr>
+          <w:rFonts w:ascii="Aptos" w:hAnsi="Aptos"/>
+          <w:i/>
+          <w:iCs/>
+          <w:sz w:val="24"/>
+          <w:szCs w:val="24"/>
+          <w:lang w:val="es-419"/>
+        </w:rPr>
+        <w:t>TRACK</w:t>
+      </w:r>
+      <w:r>
+        <w:rPr>
+          <w:rFonts w:ascii="Aptos" w:hAnsi="Aptos"/>
+          <w:i/>
+          <w:iCs/>
+          <w:sz w:val="24"/>
+          <w:szCs w:val="24"/>
+          <w:lang w:val="es-419"/>
+        </w:rPr>
+        <w:t xml:space="preserve">, Pista o Proyecto </w:t>
+      </w:r>
+      <w:r>
+        <w:rPr>
+          <w:rFonts w:ascii="Aptos" w:hAnsi="Aptos"/>
+          <w:sz w:val="24"/>
+          <w:szCs w:val="24"/>
+          <w:lang w:val="es-419"/>
+        </w:rPr>
+        <w:t>seleccionado para mejorar y aumentar la calidad de audio del resultado final.</w:t>
+      </w:r>
+    </w:p>
+    <w:p>
+      <w:pPr>
+        <w:spacing w:after="0" w:line="240" w:lineRule="auto"/>
+        <w:rPr>
+          <w:rFonts w:ascii="Aptos" w:hAnsi="Aptos"/>
+          <w:sz w:val="24"/>
+          <w:szCs w:val="24"/>
+          <w:lang w:val="es-419"/>
+        </w:rPr>
+      </w:pPr>
+    </w:p>
+    <w:p>
+      <w:pPr>
+        <w:spacing w:after="0" w:line="240" w:lineRule="auto"/>
+        <w:rPr>
+          <w:rFonts w:ascii="Aptos" w:hAnsi="Aptos"/>
+          <w:b/>
+          <w:bCs/>
+          <w:color w:val="002060"/>
+          <w:sz w:val="28"/>
+          <w:szCs w:val="28"/>
+          <w:lang w:val="es-419"/>
+        </w:rPr>
+      </w:pPr>
+      <w:r>
+        <w:rPr>
+          <w:rFonts w:ascii="Aptos" w:hAnsi="Aptos"/>
+          <w:b/>
+          <w:bCs/>
+          <w:color w:val="002060"/>
+          <w:sz w:val="28"/>
+          <w:szCs w:val="28"/>
+          <w:lang w:val="es-419"/>
+        </w:rPr>
+        <w:t>5. SALA DE ENSAYO (</w:t>
+      </w:r>
+      <w:proofErr w:type="spellStart"/>
+      <w:r>
+        <w:rPr>
+          <w:rFonts w:ascii="Aptos" w:hAnsi="Aptos"/>
+          <w:b/>
+          <w:bCs/>
+          <w:color w:val="002060"/>
+          <w:sz w:val="28"/>
+          <w:szCs w:val="28"/>
+          <w:lang w:val="es-419"/>
+        </w:rPr>
+        <w:t>Rehearsal</w:t>
+      </w:r>
+      <w:proofErr w:type="spellEnd"/>
+      <w:r>
+        <w:rPr>
+          <w:rFonts w:ascii="Aptos" w:hAnsi="Aptos"/>
+          <w:b/>
+          <w:bCs/>
+          <w:color w:val="002060"/>
+          <w:sz w:val="28"/>
+          <w:szCs w:val="28"/>
+          <w:lang w:val="es-419"/>
+        </w:rPr>
+        <w:t xml:space="preserve"> </w:t>
+      </w:r>
+      <w:proofErr w:type="spellStart"/>
+      <w:r>
+        <w:rPr>
+          <w:rFonts w:ascii="Aptos" w:hAnsi="Aptos"/>
+          <w:b/>
+          <w:bCs/>
+          <w:color w:val="002060"/>
+          <w:sz w:val="28"/>
+          <w:szCs w:val="28"/>
+          <w:lang w:val="es-419"/>
+        </w:rPr>
+        <w:t>Room</w:t>
+      </w:r>
+      <w:proofErr w:type="spellEnd"/>
+      <w:r>
+        <w:rPr>
+          <w:rFonts w:ascii="Aptos" w:hAnsi="Aptos"/>
+          <w:b/>
+          <w:bCs/>
+          <w:color w:val="002060"/>
+          <w:sz w:val="28"/>
+          <w:szCs w:val="28"/>
+          <w:lang w:val="es-419"/>
+        </w:rPr>
+        <w:t>)</w:t>
+      </w:r>
+    </w:p>
+    <w:p>
+      <w:pPr>
+        <w:spacing w:after="0" w:line="240" w:lineRule="auto"/>
+        <w:rPr>
+          <w:rFonts w:ascii="Aptos" w:hAnsi="Aptos"/>
+          <w:sz w:val="24"/>
+          <w:szCs w:val="24"/>
+          <w:lang w:val="es-419"/>
+        </w:rPr>
+      </w:pPr>
+    </w:p>
+    <w:p>
+      <w:pPr>
+        <w:spacing w:after="0" w:line="240" w:lineRule="auto"/>
+        <w:rPr>
+          <w:rFonts w:ascii="Aptos" w:hAnsi="Aptos"/>
+          <w:sz w:val="24"/>
+          <w:szCs w:val="24"/>
+          <w:lang w:val="es-419"/>
+        </w:rPr>
+      </w:pPr>
+      <w:r>
+        <w:rPr>
+          <w:rFonts w:ascii="Aptos" w:hAnsi="Aptos"/>
+          <w:sz w:val="24"/>
+          <w:szCs w:val="24"/>
+          <w:lang w:val="es-419"/>
+        </w:rPr>
+        <w:t>Funcionalidad</w:t>
       </w:r>
     </w:p>
     <w:p>
@@ -1812,7 +2712,27 @@
           <w:szCs w:val="24"/>
           <w:lang w:val="es-419"/>
         </w:rPr>
-        <w:t>La posibilidad de cargar pistas en formato MIDI .WAV .MP3 .WAC.</w:t>
+        <w:t>Posibilidad de generar una pista de audio de grabación (</w:t>
+      </w:r>
+      <w:proofErr w:type="spellStart"/>
+      <w:r>
+        <w:rPr>
+          <w:rFonts w:ascii="Aptos" w:hAnsi="Aptos"/>
+          <w:sz w:val="24"/>
+          <w:szCs w:val="24"/>
+          <w:lang w:val="es-419"/>
+        </w:rPr>
+        <w:t>Monocanal</w:t>
+      </w:r>
+      <w:proofErr w:type="spellEnd"/>
+      <w:r>
+        <w:rPr>
+          <w:rFonts w:ascii="Aptos" w:hAnsi="Aptos"/>
+          <w:sz w:val="24"/>
+          <w:szCs w:val="24"/>
+          <w:lang w:val="es-419"/>
+        </w:rPr>
+        <w:t>) a través del micrófono del dispositivo Android.</w:t>
       </w:r>
     </w:p>
     <w:p>
@@ -1836,38 +2756,223 @@
           <w:szCs w:val="24"/>
           <w:lang w:val="es-419"/>
         </w:rPr>
-        <w:t xml:space="preserve">Acceso a la edición de audio del </w:t>
-      </w:r>
-      <w:r>
-        <w:rPr>
-          <w:rFonts w:ascii="Aptos" w:hAnsi="Aptos"/>
-          <w:i/>
-          <w:iCs/>
-          <w:sz w:val="24"/>
-          <w:szCs w:val="24"/>
-          <w:lang w:val="es-419"/>
-        </w:rPr>
-        <w:t>TRACK</w:t>
-      </w:r>
-      <w:r>
-        <w:rPr>
-          <w:rFonts w:ascii="Aptos" w:hAnsi="Aptos"/>
-          <w:i/>
-          <w:iCs/>
-          <w:sz w:val="24"/>
-          <w:szCs w:val="24"/>
-          <w:lang w:val="es-419"/>
-        </w:rPr>
-        <w:t xml:space="preserve">, Pista o Proyecto </w:t>
-      </w:r>
-      <w:r>
-        <w:rPr>
-          <w:rFonts w:ascii="Aptos" w:hAnsi="Aptos"/>
-          <w:sz w:val="24"/>
-          <w:szCs w:val="24"/>
-          <w:lang w:val="es-419"/>
-        </w:rPr>
-        <w:t>seleccionado para mejorar y aumentar la calidad de audio del resultado final.</w:t>
+        <w:t xml:space="preserve">La posibilidad de cargar pistas en </w:t>
+      </w:r>
+      <w:r>
+        <w:rPr>
+          <w:rFonts w:ascii="Aptos" w:hAnsi="Aptos"/>
+          <w:sz w:val="24"/>
+          <w:szCs w:val="24"/>
+          <w:lang w:val="es-419"/>
+        </w:rPr>
+        <w:t xml:space="preserve">distintos </w:t>
+      </w:r>
+      <w:r>
+        <w:rPr>
+          <w:rFonts w:ascii="Aptos" w:hAnsi="Aptos"/>
+          <w:sz w:val="24"/>
+          <w:szCs w:val="24"/>
+          <w:lang w:val="es-419"/>
+        </w:rPr>
+        <w:t>formato</w:t>
+      </w:r>
+      <w:r>
+        <w:rPr>
+          <w:rFonts w:ascii="Aptos" w:hAnsi="Aptos"/>
+          <w:sz w:val="24"/>
+          <w:szCs w:val="24"/>
+          <w:lang w:val="es-419"/>
+        </w:rPr>
+        <w:t>s de</w:t>
+      </w:r>
+      <w:r>
+        <w:rPr>
+          <w:rFonts w:ascii="Aptos" w:hAnsi="Aptos"/>
+          <w:sz w:val="24"/>
+          <w:szCs w:val="24"/>
+          <w:lang w:val="es-419"/>
+        </w:rPr>
+        <w:t xml:space="preserve"> audio.</w:t>
+      </w:r>
+    </w:p>
+    <w:p>
+      <w:pPr>
+        <w:numPr>
+          <w:ilvl w:val="0"/>
+          <w:numId w:val="15"/>
+        </w:numPr>
+        <w:spacing w:after="0" w:line="240" w:lineRule="auto"/>
+        <w:rPr>
+          <w:rFonts w:ascii="Aptos" w:hAnsi="Aptos"/>
+          <w:sz w:val="24"/>
+          <w:szCs w:val="24"/>
+          <w:lang w:val="es-419"/>
+        </w:rPr>
+      </w:pPr>
+      <w:r>
+        <w:rPr>
+          <w:rFonts w:ascii="Aptos" w:hAnsi="Aptos"/>
+          <w:sz w:val="24"/>
+          <w:szCs w:val="24"/>
+          <w:lang w:val="es-419"/>
+        </w:rPr>
+        <w:t xml:space="preserve">Posibilidad de escuchar los </w:t>
+      </w:r>
+      <w:proofErr w:type="spellStart"/>
+      <w:r>
+        <w:rPr>
+          <w:rFonts w:ascii="Aptos" w:hAnsi="Aptos"/>
+          <w:sz w:val="24"/>
+          <w:szCs w:val="24"/>
+          <w:lang w:val="es-419"/>
+        </w:rPr>
+        <w:t>tracks</w:t>
+      </w:r>
+      <w:proofErr w:type="spellEnd"/>
+      <w:r>
+        <w:rPr>
+          <w:rFonts w:ascii="Aptos" w:hAnsi="Aptos"/>
+          <w:sz w:val="24"/>
+          <w:szCs w:val="24"/>
+          <w:lang w:val="es-419"/>
+        </w:rPr>
+        <w:t xml:space="preserve"> que ya se hayan grabado y estén guardados por el usuario.</w:t>
+      </w:r>
+    </w:p>
+    <w:p>
+      <w:pPr>
+        <w:numPr>
+          <w:ilvl w:val="0"/>
+          <w:numId w:val="15"/>
+        </w:numPr>
+        <w:spacing w:after="0" w:line="240" w:lineRule="auto"/>
+        <w:rPr>
+          <w:rFonts w:ascii="Aptos" w:hAnsi="Aptos"/>
+          <w:sz w:val="24"/>
+          <w:szCs w:val="24"/>
+          <w:lang w:val="es-419"/>
+        </w:rPr>
+      </w:pPr>
+      <w:r>
+        <w:rPr>
+          <w:rFonts w:ascii="Aptos" w:hAnsi="Aptos"/>
+          <w:sz w:val="24"/>
+          <w:szCs w:val="24"/>
+          <w:lang w:val="es-419"/>
+        </w:rPr>
+        <w:t>Posibilidad de eliminar una pista que sea desechable.</w:t>
+      </w:r>
+    </w:p>
+    <w:p>
+      <w:pPr>
+        <w:numPr>
+          <w:ilvl w:val="0"/>
+          <w:numId w:val="15"/>
+        </w:numPr>
+        <w:spacing w:after="0" w:line="240" w:lineRule="auto"/>
+        <w:rPr>
+          <w:rFonts w:ascii="Aptos" w:hAnsi="Aptos"/>
+          <w:sz w:val="24"/>
+          <w:szCs w:val="24"/>
+          <w:lang w:val="es-419"/>
+        </w:rPr>
+      </w:pPr>
+      <w:r>
+        <w:rPr>
+          <w:rFonts w:ascii="Aptos" w:hAnsi="Aptos"/>
+          <w:sz w:val="24"/>
+          <w:szCs w:val="24"/>
+          <w:lang w:val="es-419"/>
+        </w:rPr>
+        <w:t>Posibilidad de una escucha multipista (todas las pistas guardadas a la vez)</w:t>
+      </w:r>
+    </w:p>
+    <w:p>
+      <w:pPr>
+        <w:numPr>
+          <w:ilvl w:val="0"/>
+          <w:numId w:val="15"/>
+        </w:numPr>
+        <w:spacing w:after="0" w:line="240" w:lineRule="auto"/>
+        <w:rPr>
+          <w:rFonts w:ascii="Aptos" w:hAnsi="Aptos"/>
+          <w:sz w:val="24"/>
+          <w:szCs w:val="24"/>
+          <w:lang w:val="es-419"/>
+        </w:rPr>
+      </w:pPr>
+      <w:r>
+        <w:rPr>
+          <w:rFonts w:ascii="Aptos" w:hAnsi="Aptos"/>
+          <w:sz w:val="24"/>
+          <w:szCs w:val="24"/>
+          <w:lang w:val="es-419"/>
+        </w:rPr>
+        <w:t xml:space="preserve">Cada </w:t>
+      </w:r>
+      <w:proofErr w:type="spellStart"/>
+      <w:r>
+        <w:rPr>
+          <w:rFonts w:ascii="Aptos" w:hAnsi="Aptos"/>
+          <w:sz w:val="24"/>
+          <w:szCs w:val="24"/>
+          <w:lang w:val="es-419"/>
+        </w:rPr>
+        <w:t>track</w:t>
+      </w:r>
+      <w:proofErr w:type="spellEnd"/>
+      <w:r>
+        <w:rPr>
+          <w:rFonts w:ascii="Aptos" w:hAnsi="Aptos"/>
+          <w:sz w:val="24"/>
+          <w:szCs w:val="24"/>
+          <w:lang w:val="es-419"/>
+        </w:rPr>
+        <w:t xml:space="preserve"> cuenta con un botón de SOLO, MUTE y un </w:t>
+      </w:r>
+      <w:proofErr w:type="spellStart"/>
+      <w:r>
+        <w:rPr>
+          <w:rFonts w:ascii="Aptos" w:hAnsi="Aptos"/>
+          <w:sz w:val="24"/>
+          <w:szCs w:val="24"/>
+          <w:lang w:val="es-419"/>
+        </w:rPr>
+        <w:t>Fader</w:t>
+      </w:r>
+      <w:proofErr w:type="spellEnd"/>
+      <w:r>
+        <w:rPr>
+          <w:rFonts w:ascii="Aptos" w:hAnsi="Aptos"/>
+          <w:sz w:val="24"/>
+          <w:szCs w:val="24"/>
+          <w:lang w:val="es-419"/>
+        </w:rPr>
+        <w:t xml:space="preserve"> para el nivel de volumen.</w:t>
+      </w:r>
+    </w:p>
+    <w:p>
+      <w:pPr>
+        <w:numPr>
+          <w:ilvl w:val="0"/>
+          <w:numId w:val="15"/>
+        </w:numPr>
+        <w:spacing w:after="0" w:line="240" w:lineRule="auto"/>
+        <w:rPr>
+          <w:rFonts w:ascii="Aptos" w:hAnsi="Aptos"/>
+          <w:sz w:val="24"/>
+          <w:szCs w:val="24"/>
+          <w:lang w:val="es-419"/>
+        </w:rPr>
+      </w:pPr>
+      <w:r>
+        <w:rPr>
+          <w:rFonts w:ascii="Aptos" w:hAnsi="Aptos"/>
+          <w:sz w:val="24"/>
+          <w:szCs w:val="24"/>
+          <w:lang w:val="es-419"/>
+        </w:rPr>
+        <w:t>Posibilidad de desplegar el menú de edición de audio.</w:t>
       </w:r>
     </w:p>
     <w:p>
@@ -2165,6 +3270,119 @@
     </w:lvl>
   </w:abstractNum>
   <w:abstractNum w:abstractNumId="2" w15:restartNumberingAfterBreak="0">
+    <w:nsid w:val="15593312"/>
+    <w:multiLevelType w:val="hybridMultilevel"/>
+    <w:tmpl w:val="E982B90C"/>
+    <w:lvl w:ilvl="0" w:tplc="04090001">
+      <w:start w:val="1"/>
+      <w:numFmt w:val="bullet"/>
+      <w:lvlText w:val=""/>
+      <w:lvlJc w:val="left"/>
+      <w:pPr>
+        <w:ind w:left="720" w:hanging="360"/>
+      </w:pPr>
+      <w:rPr>
+        <w:rFonts w:ascii="Symbol" w:hAnsi="Symbol" w:hint="default"/>
+      </w:rPr>
+    </w:lvl>
+    <w:lvl w:ilvl="1" w:tplc="04090003" w:tentative="1">
+      <w:start w:val="1"/>
+      <w:numFmt w:val="bullet"/>
+      <w:lvlText w:val="o"/>
+      <w:lvlJc w:val="left"/>
+      <w:pPr>
+        <w:ind w:left="1440" w:hanging="360"/>
+      </w:pPr>
+      <w:rPr>
+        <w:rFonts w:ascii="Courier New" w:hAnsi="Courier New" w:cs="Courier New" w:hint="default"/>
+      </w:rPr>
+    </w:lvl>
+    <w:lvl w:ilvl="2" w:tplc="04090005" w:tentative="1">
+      <w:start w:val="1"/>
+      <w:numFmt w:val="bullet"/>
+      <w:lvlText w:val=""/>
+      <w:lvlJc w:val="left"/>
+      <w:pPr>
+        <w:ind w:left="2160" w:hanging="360"/>
+      </w:pPr>
+      <w:rPr>
+        <w:rFonts w:ascii="Wingdings" w:hAnsi="Wingdings" w:hint="default"/>
+      </w:rPr>
+    </w:lvl>
+    <w:lvl w:ilvl="3" w:tplc="04090001" w:tentative="1">
+      <w:start w:val="1"/>
+      <w:numFmt w:val="bullet"/>
+      <w:lvlText w:val=""/>
+      <w:lvlJc w:val="left"/>
+      <w:pPr>
+        <w:ind w:left="2880" w:hanging="360"/>
+      </w:pPr>
+      <w:rPr>
+        <w:rFonts w:ascii="Symbol" w:hAnsi="Symbol" w:hint="default"/>
+      </w:rPr>
+    </w:lvl>
+    <w:lvl w:ilvl="4" w:tplc="04090003" w:tentative="1">
+      <w:start w:val="1"/>
+      <w:numFmt w:val="bullet"/>
+      <w:lvlText w:val="o"/>
+      <w:lvlJc w:val="left"/>
+      <w:pPr>
+        <w:ind w:left="3600" w:hanging="360"/>
+      </w:pPr>
+      <w:rPr>
+        <w:rFonts w:ascii="Courier New" w:hAnsi="Courier New" w:cs="Courier New" w:hint="default"/>
+      </w:rPr>
+    </w:lvl>
+    <w:lvl w:ilvl="5" w:tplc="04090005" w:tentative="1">
+      <w:start w:val="1"/>
+      <w:numFmt w:val="bullet"/>
+      <w:lvlText w:val=""/>
+      <w:lvlJc w:val="left"/>
+      <w:pPr>
+        <w:ind w:left="4320" w:hanging="360"/>
+      </w:pPr>
+      <w:rPr>
+        <w:rFonts w:ascii="Wingdings" w:hAnsi="Wingdings" w:hint="default"/>
+      </w:rPr>
+    </w:lvl>
+    <w:lvl w:ilvl="6" w:tplc="04090001" w:tentative="1">
+      <w:start w:val="1"/>
+      <w:numFmt w:val="bullet"/>
+      <w:lvlText w:val=""/>
+      <w:lvlJc w:val="left"/>
+      <w:pPr>
+        <w:ind w:left="5040" w:hanging="360"/>
+      </w:pPr>
+      <w:rPr>
+        <w:rFonts w:ascii="Symbol" w:hAnsi="Symbol" w:hint="default"/>
+      </w:rPr>
+    </w:lvl>
+    <w:lvl w:ilvl="7" w:tplc="04090003" w:tentative="1">
+      <w:start w:val="1"/>
+      <w:numFmt w:val="bullet"/>
+      <w:lvlText w:val="o"/>
+      <w:lvlJc w:val="left"/>
+      <w:pPr>
+        <w:ind w:left="5760" w:hanging="360"/>
+      </w:pPr>
+      <w:rPr>
+        <w:rFonts w:ascii="Courier New" w:hAnsi="Courier New" w:cs="Courier New" w:hint="default"/>
+      </w:rPr>
+    </w:lvl>
+    <w:lvl w:ilvl="8" w:tplc="04090005" w:tentative="1">
+      <w:start w:val="1"/>
+      <w:numFmt w:val="bullet"/>
+      <w:lvlText w:val=""/>
+      <w:lvlJc w:val="left"/>
+      <w:pPr>
+        <w:ind w:left="6480" w:hanging="360"/>
+      </w:pPr>
+      <w:rPr>
+        <w:rFonts w:ascii="Wingdings" w:hAnsi="Wingdings" w:hint="default"/>
+      </w:rPr>
+    </w:lvl>
+  </w:abstractNum>
+  <w:abstractNum w:abstractNumId="3" w15:restartNumberingAfterBreak="0">
     <w:nsid w:val="195045AA"/>
     <w:multiLevelType w:val="hybridMultilevel"/>
     <w:tmpl w:val="85347D18"/>
@@ -2250,7 +3468,7 @@
       </w:pPr>
     </w:lvl>
   </w:abstractNum>
-  <w:abstractNum w:abstractNumId="3" w15:restartNumberingAfterBreak="0">
+  <w:abstractNum w:abstractNumId="4" w15:restartNumberingAfterBreak="0">
     <w:nsid w:val="1B153768"/>
     <w:multiLevelType w:val="multilevel"/>
     <w:tmpl w:val="9B2447F6"/>
@@ -2399,7 +3617,7 @@
       </w:rPr>
     </w:lvl>
   </w:abstractNum>
-  <w:abstractNum w:abstractNumId="4" w15:restartNumberingAfterBreak="0">
+  <w:abstractNum w:abstractNumId="5" w15:restartNumberingAfterBreak="0">
     <w:nsid w:val="1E4862CD"/>
     <w:multiLevelType w:val="multilevel"/>
     <w:tmpl w:val="2E6429BC"/>
@@ -2548,7 +3766,7 @@
       </w:rPr>
     </w:lvl>
   </w:abstractNum>
-  <w:abstractNum w:abstractNumId="5" w15:restartNumberingAfterBreak="0">
+  <w:abstractNum w:abstractNumId="6" w15:restartNumberingAfterBreak="0">
     <w:nsid w:val="24E46E38"/>
     <w:multiLevelType w:val="hybridMultilevel"/>
     <w:tmpl w:val="55AC09C2"/>
@@ -2661,7 +3879,7 @@
       </w:rPr>
     </w:lvl>
   </w:abstractNum>
-  <w:abstractNum w:abstractNumId="6" w15:restartNumberingAfterBreak="0">
+  <w:abstractNum w:abstractNumId="7" w15:restartNumberingAfterBreak="0">
     <w:nsid w:val="252D5B6A"/>
     <w:multiLevelType w:val="multilevel"/>
     <w:tmpl w:val="86DE8572"/>
@@ -2810,7 +4028,7 @@
       </w:rPr>
     </w:lvl>
   </w:abstractNum>
-  <w:abstractNum w:abstractNumId="7" w15:restartNumberingAfterBreak="0">
+  <w:abstractNum w:abstractNumId="8" w15:restartNumberingAfterBreak="0">
     <w:nsid w:val="2E0D6471"/>
     <w:multiLevelType w:val="multilevel"/>
     <w:tmpl w:val="11B014D0"/>
@@ -2959,7 +4177,7 @@
       </w:rPr>
     </w:lvl>
   </w:abstractNum>
-  <w:abstractNum w:abstractNumId="8" w15:restartNumberingAfterBreak="0">
+  <w:abstractNum w:abstractNumId="9" w15:restartNumberingAfterBreak="0">
     <w:nsid w:val="31152941"/>
     <w:multiLevelType w:val="hybridMultilevel"/>
     <w:tmpl w:val="95984C0A"/>
@@ -3072,7 +4290,7 @@
       </w:rPr>
     </w:lvl>
   </w:abstractNum>
-  <w:abstractNum w:abstractNumId="9" w15:restartNumberingAfterBreak="0">
+  <w:abstractNum w:abstractNumId="10" w15:restartNumberingAfterBreak="0">
     <w:nsid w:val="31D56566"/>
     <w:multiLevelType w:val="multilevel"/>
     <w:tmpl w:val="9F46BBA6"/>
@@ -3221,7 +4439,7 @@
       </w:rPr>
     </w:lvl>
   </w:abstractNum>
-  <w:abstractNum w:abstractNumId="10" w15:restartNumberingAfterBreak="0">
+  <w:abstractNum w:abstractNumId="11" w15:restartNumberingAfterBreak="0">
     <w:nsid w:val="38055957"/>
     <w:multiLevelType w:val="multilevel"/>
     <w:tmpl w:val="699AD872"/>
@@ -3370,7 +4588,7 @@
       </w:rPr>
     </w:lvl>
   </w:abstractNum>
-  <w:abstractNum w:abstractNumId="11" w15:restartNumberingAfterBreak="0">
+  <w:abstractNum w:abstractNumId="12" w15:restartNumberingAfterBreak="0">
     <w:nsid w:val="3CB95780"/>
     <w:multiLevelType w:val="multilevel"/>
     <w:tmpl w:val="422C13EC"/>
@@ -3519,7 +4737,7 @@
       </w:rPr>
     </w:lvl>
   </w:abstractNum>
-  <w:abstractNum w:abstractNumId="12" w15:restartNumberingAfterBreak="0">
+  <w:abstractNum w:abstractNumId="13" w15:restartNumberingAfterBreak="0">
     <w:nsid w:val="4FB22719"/>
     <w:multiLevelType w:val="hybridMultilevel"/>
     <w:tmpl w:val="4BDEFD20"/>
@@ -3632,7 +4850,7 @@
       </w:rPr>
     </w:lvl>
   </w:abstractNum>
-  <w:abstractNum w:abstractNumId="13" w15:restartNumberingAfterBreak="0">
+  <w:abstractNum w:abstractNumId="14" w15:restartNumberingAfterBreak="0">
     <w:nsid w:val="507B5180"/>
     <w:multiLevelType w:val="hybridMultilevel"/>
     <w:tmpl w:val="AE44F040"/>
@@ -3745,7 +4963,7 @@
       </w:rPr>
     </w:lvl>
   </w:abstractNum>
-  <w:abstractNum w:abstractNumId="14" w15:restartNumberingAfterBreak="0">
+  <w:abstractNum w:abstractNumId="15" w15:restartNumberingAfterBreak="0">
     <w:nsid w:val="546C6E13"/>
     <w:multiLevelType w:val="hybridMultilevel"/>
     <w:tmpl w:val="3B3A872A"/>
@@ -3858,7 +5076,7 @@
       </w:rPr>
     </w:lvl>
   </w:abstractNum>
-  <w:abstractNum w:abstractNumId="15" w15:restartNumberingAfterBreak="0">
+  <w:abstractNum w:abstractNumId="16" w15:restartNumberingAfterBreak="0">
     <w:nsid w:val="54C42DB5"/>
     <w:multiLevelType w:val="hybridMultilevel"/>
     <w:tmpl w:val="4FA28BBA"/>
@@ -3971,7 +5189,7 @@
       </w:rPr>
     </w:lvl>
   </w:abstractNum>
-  <w:abstractNum w:abstractNumId="16" w15:restartNumberingAfterBreak="0">
+  <w:abstractNum w:abstractNumId="17" w15:restartNumberingAfterBreak="0">
     <w:nsid w:val="5714616B"/>
     <w:multiLevelType w:val="hybridMultilevel"/>
     <w:tmpl w:val="2CAABCF2"/>
@@ -4084,7 +5302,7 @@
       </w:rPr>
     </w:lvl>
   </w:abstractNum>
-  <w:abstractNum w:abstractNumId="17" w15:restartNumberingAfterBreak="0">
+  <w:abstractNum w:abstractNumId="18" w15:restartNumberingAfterBreak="0">
     <w:nsid w:val="594157F7"/>
     <w:multiLevelType w:val="hybridMultilevel"/>
     <w:tmpl w:val="029EC248"/>
@@ -4197,7 +5415,7 @@
       </w:rPr>
     </w:lvl>
   </w:abstractNum>
-  <w:abstractNum w:abstractNumId="18" w15:restartNumberingAfterBreak="0">
+  <w:abstractNum w:abstractNumId="19" w15:restartNumberingAfterBreak="0">
     <w:nsid w:val="632F4E07"/>
     <w:multiLevelType w:val="multilevel"/>
     <w:tmpl w:val="5044D3E6"/>
@@ -4346,7 +5564,7 @@
       </w:rPr>
     </w:lvl>
   </w:abstractNum>
-  <w:abstractNum w:abstractNumId="19" w15:restartNumberingAfterBreak="0">
+  <w:abstractNum w:abstractNumId="20" w15:restartNumberingAfterBreak="0">
     <w:nsid w:val="6EC379F3"/>
     <w:multiLevelType w:val="multilevel"/>
     <w:tmpl w:val="7A3CE104"/>
@@ -4495,7 +5713,7 @@
       </w:rPr>
     </w:lvl>
   </w:abstractNum>
-  <w:abstractNum w:abstractNumId="20" w15:restartNumberingAfterBreak="0">
+  <w:abstractNum w:abstractNumId="21" w15:restartNumberingAfterBreak="0">
     <w:nsid w:val="771412F7"/>
     <w:multiLevelType w:val="hybridMultilevel"/>
     <w:tmpl w:val="83C49200"/>
@@ -4608,7 +5826,7 @@
       </w:rPr>
     </w:lvl>
   </w:abstractNum>
-  <w:abstractNum w:abstractNumId="21" w15:restartNumberingAfterBreak="0">
+  <w:abstractNum w:abstractNumId="22" w15:restartNumberingAfterBreak="0">
     <w:nsid w:val="7B7631F5"/>
     <w:multiLevelType w:val="multilevel"/>
     <w:tmpl w:val="7D98CC18"/>
@@ -4757,7 +5975,7 @@
       </w:rPr>
     </w:lvl>
   </w:abstractNum>
-  <w:abstractNum w:abstractNumId="22" w15:restartNumberingAfterBreak="0">
+  <w:abstractNum w:abstractNumId="23" w15:restartNumberingAfterBreak="0">
     <w:nsid w:val="7BE837AB"/>
     <w:multiLevelType w:val="multilevel"/>
     <w:tmpl w:val="D2382E6A"/>
@@ -4907,73 +6125,76 @@
     </w:lvl>
   </w:abstractNum>
   <w:num w:numId="1" w16cid:durableId="384915129">
+    <w:abstractNumId w:val="14"/>
+  </w:num>
+  <w:num w:numId="2" w16cid:durableId="2011326661">
+    <w:abstractNumId w:val="3"/>
+  </w:num>
+  <w:num w:numId="3" w16cid:durableId="529495423">
     <w:abstractNumId w:val="13"/>
   </w:num>
-  <w:num w:numId="2" w16cid:durableId="2011326661">
-    <w:abstractNumId w:val="2"/>
+  <w:num w:numId="4" w16cid:durableId="1333096785">
+    <w:abstractNumId w:val="21"/>
   </w:num>
-  <w:num w:numId="3" w16cid:durableId="529495423">
+  <w:num w:numId="5" w16cid:durableId="1873033304">
+    <w:abstractNumId w:val="7"/>
+  </w:num>
+  <w:num w:numId="6" w16cid:durableId="1292596591">
     <w:abstractNumId w:val="12"/>
   </w:num>
-  <w:num w:numId="4" w16cid:durableId="1333096785">
+  <w:num w:numId="7" w16cid:durableId="1549685491">
+    <w:abstractNumId w:val="19"/>
+  </w:num>
+  <w:num w:numId="8" w16cid:durableId="2141412138">
     <w:abstractNumId w:val="20"/>
   </w:num>
-  <w:num w:numId="5" w16cid:durableId="1873033304">
-    <w:abstractNumId w:val="6"/>
-  </w:num>
-  <w:num w:numId="6" w16cid:durableId="1292596591">
-    <w:abstractNumId w:val="11"/>
-  </w:num>
-  <w:num w:numId="7" w16cid:durableId="1549685491">
-    <w:abstractNumId w:val="18"/>
-  </w:num>
-  <w:num w:numId="8" w16cid:durableId="2141412138">
-    <w:abstractNumId w:val="19"/>
-  </w:num>
   <w:num w:numId="9" w16cid:durableId="905070870">
-    <w:abstractNumId w:val="4"/>
+    <w:abstractNumId w:val="5"/>
   </w:num>
   <w:num w:numId="10" w16cid:durableId="1420328485">
     <w:abstractNumId w:val="0"/>
   </w:num>
   <w:num w:numId="11" w16cid:durableId="495194057">
-    <w:abstractNumId w:val="3"/>
+    <w:abstractNumId w:val="4"/>
   </w:num>
   <w:num w:numId="12" w16cid:durableId="343242754">
-    <w:abstractNumId w:val="10"/>
+    <w:abstractNumId w:val="11"/>
   </w:num>
   <w:num w:numId="13" w16cid:durableId="604727179">
-    <w:abstractNumId w:val="9"/>
+    <w:abstractNumId w:val="10"/>
   </w:num>
   <w:num w:numId="14" w16cid:durableId="566652317">
     <w:abstractNumId w:val="1"/>
   </w:num>
   <w:num w:numId="15" w16cid:durableId="1989748064">
-    <w:abstractNumId w:val="7"/>
+    <w:abstractNumId w:val="8"/>
   </w:num>
   <w:num w:numId="16" w16cid:durableId="392126309">
-    <w:abstractNumId w:val="21"/>
+    <w:abstractNumId w:val="22"/>
   </w:num>
   <w:num w:numId="17" w16cid:durableId="209851011">
-    <w:abstractNumId w:val="22"/>
+    <w:abstractNumId w:val="23"/>
   </w:num>
   <w:num w:numId="18" w16cid:durableId="278535915">
+    <w:abstractNumId w:val="17"/>
+  </w:num>
+  <w:num w:numId="19" w16cid:durableId="1820343737">
+    <w:abstractNumId w:val="9"/>
+  </w:num>
+  <w:num w:numId="20" w16cid:durableId="803084815">
     <w:abstractNumId w:val="16"/>
   </w:num>
-  <w:num w:numId="19" w16cid:durableId="1820343737">
-    <w:abstractNumId w:val="8"/>
+  <w:num w:numId="21" w16cid:durableId="474371833">
+    <w:abstractNumId w:val="18"/>
   </w:num>
-  <w:num w:numId="20" w16cid:durableId="803084815">
+  <w:num w:numId="22" w16cid:durableId="1456407797">
     <w:abstractNumId w:val="15"/>
   </w:num>
-  <w:num w:numId="21" w16cid:durableId="474371833">
-    <w:abstractNumId w:val="17"/>
+  <w:num w:numId="23" w16cid:durableId="107940347">
+    <w:abstractNumId w:val="6"/>
   </w:num>
-  <w:num w:numId="22" w16cid:durableId="1456407797">
-    <w:abstractNumId w:val="14"/>
-  </w:num>
-  <w:num w:numId="23" w16cid:durableId="107940347">
-    <w:abstractNumId w:val="5"/>
+  <w:num w:numId="24" w16cid:durableId="1115832567">
+    <w:abstractNumId w:val="2"/>
   </w:num>
 </w:numbering>
 </file>
@@ -5581,6 +6802,7 @@
   <w:style w:type="character" w:default="1" w:styleId="Fuentedeprrafopredeter">
     <w:name w:val="Default Paragraph Font"/>
     <w:uiPriority w:val="1"/>
+    <w:semiHidden/>
     <w:unhideWhenUsed/>
   </w:style>
   <w:style w:type="table" w:default="1" w:styleId="Tablanormal">

</xml_diff>